<commit_message>
Aterramento: modo simplificado só com hastes e esboço da instalação
- Seletor Simplificado / Completo na aba Aterramento; o simplificado
  aceita só arranjos de hastes (cabo e malha ficam no modo completo)
- Resistividade por tipo de solo (valores típicos de Kindermann &
  Campagnolo, limite superior da faixa), informada ou pela média das
  medições de Wenner
- Número mínimo de hastes para o limite com botão "Usar N hastes",
  gráfico da resistência em função do número de hastes e lista de
  materiais (hastes, conectores, caixas de inspeção, cabo e eletroduto)
- Esboço da instalação sem escala: quadro/BEP, condutor em eletroduto,
  caixas de inspeção, cabo nu de interligação e hastes, na tela e no
  memorial
- Memorial simplificado com título, normas e rodapé do método; projeto
  de exemplo no modo simplificado (padrão de entrada com 4 hastes)

Co-Authored-By: Claude Opus 5.5 <noreply@anthropic.com>
Claude-Session: https://claude.ai/code/session_01E4Px4gvzC9MkKBX1rn21ys
</commit_message>
<xml_diff>
--- a/exemplo/memoria-circuitos-residencia-unifamiliar-exemplo-r00.docx
+++ b/exemplo/memoria-circuitos-residencia-unifamiliar-exemplo-r00.docx
@@ -482,7 +482,7 @@
                 <w:szCs w:val="19"/>
                 <w:rFonts w:ascii="Calibri" w:cs="Calibri" w:eastAsia="Calibri" w:hAnsi="Calibri"/>
               </w:rPr>
-              <w:t xml:space="preserve">17/10/2026 — R00</w:t>
+              <w:t xml:space="preserve">20/10/2026 — R00</w:t>
             </w:r>
           </w:p>
         </w:tc>
@@ -32933,7 +32933,7 @@
           <w:szCs w:val="20"/>
           <w:rFonts w:ascii="Calibri" w:cs="Calibri" w:eastAsia="Calibri" w:hAnsi="Calibri"/>
         </w:rPr>
-        <w:t xml:space="preserve">Cidade – UF, 17 de outubro de 2026</w:t>
+        <w:t xml:space="preserve">Cidade – UF, 20 de outubro de 2026</w:t>
       </w:r>
     </w:p>
     <w:p>
@@ -33471,7 +33471,7 @@
         <w:szCs w:val="15"/>
         <w:rFonts w:ascii="Calibri" w:cs="Calibri" w:eastAsia="Calibri" w:hAnsi="Calibri"/>
       </w:rPr>
-      <w:t xml:space="preserve">	R00 · 17/10/2026</w:t>
+      <w:t xml:space="preserve">	R00 · 20/10/2026</w:t>
     </w:r>
   </w:p>
 </w:hdr>

</xml_diff>